<commit_message>
docs: adicionar identificacao do aluno
</commit_message>
<xml_diff>
--- a/docs/Trabalho_TechFlow_Task_Manager.docx
+++ b/docs/Trabalho_TechFlow_Task_Manager.docx
@@ -41,6 +41,10 @@
           <w:sz w:val="22"/>
         </w:rPr>
         <w:t>Projeto acadêmico - TechFlow Solutions</w:t>
+        <w:br/>
+        <w:t>Aluno: Guilherme Pereira da Silva</w:t>
+        <w:br/>
+        <w:t>RA: 142006</w:t>
         <w:br/>
         <w:t>Sistema web de gerenciamento de tarefas para uma startup de logística</w:t>
       </w:r>

</xml_diff>